<commit_message>
Add Assessment Evaluation feature and UI updates, AddedAssessmentEvaluations Table in Database
Introduced a new `AssessmentEvaluationForm` for evaluating applicants and updating their application status. Integrated the form into the `HRDashboard` with a new navigation button. Updated `DocumentsForm` and `HRDashboard` layouts for better usability. Added database logic for loading applicants, saving evaluations, and updating statuses. Updated project files to include the new form and its resources.
</commit_message>
<xml_diff>
--- a/DatabaseDictionary.docx
+++ b/DatabaseDictionary.docx
@@ -3636,38 +3636,409 @@
       </w:tr>
     </w:tbl>
     <w:p/>
-    <w:p/>
-    <w:p/>
-    <w:p/>
-    <w:p/>
-    <w:p/>
-    <w:p/>
-    <w:p/>
-    <w:p/>
+    <w:p>
+      <w:pPr>
+        <w:pStyle w:val="Heading2"/>
+      </w:pPr>
+      <w:r>
+        <w:t>Table: AssessmentEvaluations</w:t>
+      </w:r>
+    </w:p>
+    <w:p>
+      <w:r>
+        <w:t>Purpse: Stores Assessment Result</w:t>
+      </w:r>
+    </w:p>
+    <w:tbl>
+      <w:tblPr>
+        <w:tblStyle w:val="TableGrid"/>
+        <w:tblW w:w="0" w:type="auto"/>
+        <w:tblLook w:val="04A0" w:firstRow="1" w:lastRow="0" w:firstColumn="1" w:lastColumn="0" w:noHBand="0" w:noVBand="1"/>
+      </w:tblPr>
+      <w:tblGrid>
+        <w:gridCol w:w="2160"/>
+        <w:gridCol w:w="2160"/>
+        <w:gridCol w:w="2160"/>
+        <w:gridCol w:w="2160"/>
+      </w:tblGrid>
+      <w:tr>
+        <w:tc>
+          <w:tcPr>
+            <w:tcW w:w="2160" w:type="dxa"/>
+          </w:tcPr>
+          <w:p>
+            <w:r>
+              <w:t>Field Name</w:t>
+            </w:r>
+          </w:p>
+        </w:tc>
+        <w:tc>
+          <w:tcPr>
+            <w:tcW w:w="2160" w:type="dxa"/>
+          </w:tcPr>
+          <w:p>
+            <w:r>
+              <w:t>Data Type</w:t>
+            </w:r>
+          </w:p>
+        </w:tc>
+        <w:tc>
+          <w:tcPr>
+            <w:tcW w:w="2160" w:type="dxa"/>
+          </w:tcPr>
+          <w:p>
+            <w:r>
+              <w:t>Key</w:t>
+            </w:r>
+          </w:p>
+        </w:tc>
+        <w:tc>
+          <w:tcPr>
+            <w:tcW w:w="2160" w:type="dxa"/>
+          </w:tcPr>
+          <w:p>
+            <w:r>
+              <w:t>Description</w:t>
+            </w:r>
+          </w:p>
+        </w:tc>
+      </w:tr>
+      <w:tr>
+        <w:tc>
+          <w:tcPr>
+            <w:tcW w:w="2160" w:type="dxa"/>
+          </w:tcPr>
+          <w:p>
+            <w:r>
+              <w:t>AssessmentID</w:t>
+            </w:r>
+          </w:p>
+        </w:tc>
+        <w:tc>
+          <w:tcPr>
+            <w:tcW w:w="2160" w:type="dxa"/>
+          </w:tcPr>
+          <w:p>
+            <w:r>
+              <w:t>AutoNumber</w:t>
+            </w:r>
+          </w:p>
+        </w:tc>
+        <w:tc>
+          <w:tcPr>
+            <w:tcW w:w="2160" w:type="dxa"/>
+          </w:tcPr>
+          <w:p>
+            <w:r>
+              <w:t>PK</w:t>
+            </w:r>
+          </w:p>
+        </w:tc>
+        <w:tc>
+          <w:tcPr>
+            <w:tcW w:w="2160" w:type="dxa"/>
+          </w:tcPr>
+          <w:p>
+            <w:r>
+              <w:t>Unique evaluation ID</w:t>
+            </w:r>
+          </w:p>
+        </w:tc>
+      </w:tr>
+      <w:tr>
+        <w:tc>
+          <w:tcPr>
+            <w:tcW w:w="2160" w:type="dxa"/>
+          </w:tcPr>
+          <w:p>
+            <w:r>
+              <w:t>ApplicationID</w:t>
+            </w:r>
+          </w:p>
+        </w:tc>
+        <w:tc>
+          <w:tcPr>
+            <w:tcW w:w="2160" w:type="dxa"/>
+          </w:tcPr>
+          <w:p>
+            <w:r>
+              <w:t>Number</w:t>
+            </w:r>
+          </w:p>
+        </w:tc>
+        <w:tc>
+          <w:tcPr>
+            <w:tcW w:w="2160" w:type="dxa"/>
+          </w:tcPr>
+          <w:p>
+            <w:pPr>
+              <w:tabs>
+                <w:tab w:val="center" w:pos="972"/>
+              </w:tabs>
+            </w:pPr>
+            <w:r>
+              <w:tab/>
+            </w:r>
+          </w:p>
+        </w:tc>
+        <w:tc>
+          <w:tcPr>
+            <w:tcW w:w="2160" w:type="dxa"/>
+          </w:tcPr>
+          <w:p>
+            <w:r>
+              <w:t>References Applications</w:t>
+            </w:r>
+          </w:p>
+        </w:tc>
+      </w:tr>
+      <w:tr>
+        <w:tc>
+          <w:tcPr>
+            <w:tcW w:w="2160" w:type="dxa"/>
+          </w:tcPr>
+          <w:p>
+            <w:r>
+              <w:t>AssessmentType</w:t>
+            </w:r>
+          </w:p>
+        </w:tc>
+        <w:tc>
+          <w:tcPr>
+            <w:tcW w:w="2160" w:type="dxa"/>
+          </w:tcPr>
+          <w:p>
+            <w:r>
+              <w:t>Short Text</w:t>
+            </w:r>
+          </w:p>
+        </w:tc>
+        <w:tc>
+          <w:tcPr>
+            <w:tcW w:w="2160" w:type="dxa"/>
+          </w:tcPr>
+          <w:p/>
+        </w:tc>
+        <w:tc>
+          <w:tcPr>
+            <w:tcW w:w="2160" w:type="dxa"/>
+          </w:tcPr>
+          <w:p>
+            <w:r>
+              <w:t>Stores Assessment Type</w:t>
+            </w:r>
+          </w:p>
+        </w:tc>
+      </w:tr>
+      <w:tr>
+        <w:tc>
+          <w:tcPr>
+            <w:tcW w:w="2160" w:type="dxa"/>
+          </w:tcPr>
+          <w:p>
+            <w:r>
+              <w:t>Score</w:t>
+            </w:r>
+          </w:p>
+        </w:tc>
+        <w:tc>
+          <w:tcPr>
+            <w:tcW w:w="2160" w:type="dxa"/>
+          </w:tcPr>
+          <w:p>
+            <w:r>
+              <w:t>Number</w:t>
+            </w:r>
+          </w:p>
+        </w:tc>
+        <w:tc>
+          <w:tcPr>
+            <w:tcW w:w="2160" w:type="dxa"/>
+          </w:tcPr>
+          <w:p/>
+        </w:tc>
+        <w:tc>
+          <w:tcPr>
+            <w:tcW w:w="2160" w:type="dxa"/>
+          </w:tcPr>
+          <w:p>
+            <w:r>
+              <w:t>Evaluation score</w:t>
+            </w:r>
+          </w:p>
+        </w:tc>
+      </w:tr>
+      <w:tr>
+        <w:tc>
+          <w:tcPr>
+            <w:tcW w:w="2160" w:type="dxa"/>
+          </w:tcPr>
+          <w:p>
+            <w:r>
+              <w:t>Result</w:t>
+            </w:r>
+          </w:p>
+        </w:tc>
+        <w:tc>
+          <w:tcPr>
+            <w:tcW w:w="2160" w:type="dxa"/>
+          </w:tcPr>
+          <w:p>
+            <w:r>
+              <w:t>Short Text</w:t>
+            </w:r>
+          </w:p>
+        </w:tc>
+        <w:tc>
+          <w:tcPr>
+            <w:tcW w:w="2160" w:type="dxa"/>
+          </w:tcPr>
+          <w:p/>
+        </w:tc>
+        <w:tc>
+          <w:tcPr>
+            <w:tcW w:w="2160" w:type="dxa"/>
+          </w:tcPr>
+          <w:p>
+            <w:r>
+              <w:t>Pass/Fail</w:t>
+            </w:r>
+          </w:p>
+        </w:tc>
+      </w:tr>
+      <w:tr>
+        <w:tc>
+          <w:tcPr>
+            <w:tcW w:w="2160" w:type="dxa"/>
+          </w:tcPr>
+          <w:p>
+            <w:r>
+              <w:t>Remarks</w:t>
+            </w:r>
+          </w:p>
+        </w:tc>
+        <w:tc>
+          <w:tcPr>
+            <w:tcW w:w="2160" w:type="dxa"/>
+          </w:tcPr>
+          <w:p>
+            <w:r>
+              <w:t>Long Text</w:t>
+            </w:r>
+          </w:p>
+        </w:tc>
+        <w:tc>
+          <w:tcPr>
+            <w:tcW w:w="2160" w:type="dxa"/>
+          </w:tcPr>
+          <w:p/>
+        </w:tc>
+        <w:tc>
+          <w:tcPr>
+            <w:tcW w:w="2160" w:type="dxa"/>
+          </w:tcPr>
+          <w:p>
+            <w:r>
+              <w:t>Assessment</w:t>
+            </w:r>
+            <w:r>
+              <w:t xml:space="preserve"> remarks</w:t>
+            </w:r>
+          </w:p>
+        </w:tc>
+      </w:tr>
+      <w:tr>
+        <w:tc>
+          <w:tcPr>
+            <w:tcW w:w="2160" w:type="dxa"/>
+          </w:tcPr>
+          <w:p>
+            <w:r>
+              <w:t>AssessedBy</w:t>
+            </w:r>
+          </w:p>
+        </w:tc>
+        <w:tc>
+          <w:tcPr>
+            <w:tcW w:w="2160" w:type="dxa"/>
+          </w:tcPr>
+          <w:p>
+            <w:r>
+              <w:t>Number</w:t>
+            </w:r>
+          </w:p>
+        </w:tc>
+        <w:tc>
+          <w:tcPr>
+            <w:tcW w:w="2160" w:type="dxa"/>
+          </w:tcPr>
+          <w:p/>
+        </w:tc>
+        <w:tc>
+          <w:tcPr>
+            <w:tcW w:w="2160" w:type="dxa"/>
+          </w:tcPr>
+          <w:p>
+            <w:r>
+              <w:t>References User</w:t>
+            </w:r>
+          </w:p>
+        </w:tc>
+      </w:tr>
+      <w:tr>
+        <w:tc>
+          <w:tcPr>
+            <w:tcW w:w="2160" w:type="dxa"/>
+          </w:tcPr>
+          <w:p>
+            <w:r>
+              <w:t>DateAssessed</w:t>
+            </w:r>
+          </w:p>
+        </w:tc>
+        <w:tc>
+          <w:tcPr>
+            <w:tcW w:w="2160" w:type="dxa"/>
+          </w:tcPr>
+          <w:p>
+            <w:r>
+              <w:t>Date/Time</w:t>
+            </w:r>
+          </w:p>
+        </w:tc>
+        <w:tc>
+          <w:tcPr>
+            <w:tcW w:w="2160" w:type="dxa"/>
+          </w:tcPr>
+          <w:p/>
+        </w:tc>
+        <w:tc>
+          <w:tcPr>
+            <w:tcW w:w="2160" w:type="dxa"/>
+          </w:tcPr>
+          <w:p>
+            <w:r>
+              <w:t>Date Assessed</w:t>
+            </w:r>
+          </w:p>
+        </w:tc>
+      </w:tr>
+    </w:tbl>
     <w:p/>
     <w:p>
       <w:pPr>
         <w:pStyle w:val="Heading2"/>
       </w:pPr>
       <w:r>
-        <w:lastRenderedPageBreak/>
         <w:t>ERD (Entity-Relationship Diagram)</w:t>
       </w:r>
     </w:p>
     <w:p>
       <w:r>
         <w:drawing>
-          <wp:anchor distT="0" distB="0" distL="114300" distR="114300" simplePos="0" relativeHeight="251658240" behindDoc="0" locked="0" layoutInCell="1" allowOverlap="1" wp14:anchorId="060DD075" wp14:editId="36DD2021">
-            <wp:simplePos x="0" y="0"/>
-            <wp:positionH relativeFrom="column">
-              <wp:posOffset>0</wp:posOffset>
-            </wp:positionH>
-            <wp:positionV relativeFrom="paragraph">
-              <wp:posOffset>0</wp:posOffset>
-            </wp:positionV>
-            <wp:extent cx="5486400" cy="2917190"/>
-            <wp:effectExtent l="0" t="0" r="0" b="0"/>
-            <wp:wrapTopAndBottom/>
+          <wp:inline distT="0" distB="0" distL="0" distR="0" wp14:anchorId="7587DAA1" wp14:editId="13BCB55E">
+            <wp:extent cx="5486400" cy="2950845"/>
+            <wp:effectExtent l="0" t="0" r="0" b="1905"/>
             <wp:docPr id="1" name="Picture 1"/>
             <wp:cNvGraphicFramePr>
               <a:graphicFrameLocks xmlns:a="http://schemas.openxmlformats.org/drawingml/2006/main" noChangeAspect="1"/>
@@ -3688,7 +4059,7 @@
                   <pic:spPr>
                     <a:xfrm>
                       <a:off x="0" y="0"/>
-                      <a:ext cx="5486400" cy="2917190"/>
+                      <a:ext cx="5486400" cy="2950845"/>
                     </a:xfrm>
                     <a:prstGeom prst="rect">
                       <a:avLst/>
@@ -3697,7 +4068,7 @@
                 </pic:pic>
               </a:graphicData>
             </a:graphic>
-          </wp:anchor>
+          </wp:inline>
         </w:drawing>
       </w:r>
     </w:p>
@@ -4303,7 +4674,7 @@
   <w:style w:type="paragraph" w:default="1" w:styleId="Normal">
     <w:name w:val="Normal"/>
     <w:qFormat/>
-    <w:rsid w:val="00FC693F"/>
+    <w:rsid w:val="00086EEA"/>
   </w:style>
   <w:style w:type="paragraph" w:styleId="Heading1">
     <w:name w:val="heading 1"/>

</xml_diff>